<commit_message>
Redesign China Tech Trip with bilingual journeys and interactive navigation
</commit_message>
<xml_diff>
--- a/frontend/journeys/hangzhou-2027/downloads/Hangzhou-2027-Proposed-Itinerary.docx
+++ b/frontend/journeys/hangzhou-2027/downloads/Hangzhou-2027-Proposed-Itinerary.docx
@@ -7,7 +7,7 @@
         <w:pStyle w:val="Title"/>
       </w:pPr>
       <w:r>
-        <w:t>Hangzhou Tech &amp; Innovation Journey 2027</w:t>
+        <w:t>China Tech &amp; Culture Journey 2027</w:t>
       </w:r>
     </w:p>
     <w:p>
@@ -15,31 +15,24 @@
         <w:pStyle w:val="Subtitle"/>
       </w:pPr>
       <w:r>
-        <w:t>Proposed Itinerary</w:t>
+        <w:t>Shanghai and Hangzhou Proposed Itinerary</w:t>
       </w:r>
     </w:p>
     <w:p>
       <w:r>
-        <w:t>Robotics, Entrepreneurship &amp; China-Europe Exchange</w:t>
+        <w:t>Robotics, City Life &amp; China–Europe Exchange</w:t>
       </w:r>
     </w:p>
     <w:p>
       <w:r>
-        <w:t>27 March - 4 April 2027 (provisional)  |  9 days / 8 nights</w:t>
+        <w:t>27 March – 4 April 2027 (provisional) | 9 days / 8 nights | Around 30 participants</w:t>
         <w:br/>
-        <w:t>Hangzhou, China  |  Approximately 30 participants</w:t>
-        <w:br/>
-        <w:t>English-led programme with Chinese-English interpretation</w:t>
+        <w:t>English with Chinese–English interpretation</w:t>
       </w:r>
     </w:p>
     <w:p>
       <w:r>
-        <w:t>A proposed journey for entrepreneurs and technology professionals from European university and alumni communities. Explore robotics, meet research and industry teams, develop ideas together and discover Hangzhou at a comfortable pace.</w:t>
-      </w:r>
-    </w:p>
-    <w:p>
-      <w:r>
-        <w:t>One hotel throughout. Most evenings are free. All company visits and research exchanges are subject to host confirmation.</w:t>
+        <w:t>Discover two cities through culture, everyday life and selected robotics encounters. Three nights in Shanghai and five in Hangzhou mean one hotel change. Two proposed company visits and a half-day innovation salon leave more time for exploration and rest.</w:t>
       </w:r>
     </w:p>
     <w:p>
@@ -47,153 +40,58 @@
         <w:pStyle w:val="Heading1"/>
       </w:pPr>
       <w:r>
-        <w:t>Arrival and technology exploration</w:t>
+        <w:t>Shanghai and the journey to Hangzhou</w:t>
       </w:r>
     </w:p>
     <w:tbl>
       <w:tblPr>
+        <w:tblStyle w:val="LightShading-Accent1"/>
         <w:tblW w:type="auto" w:w="0"/>
-        <w:jc w:val="center"/>
-        <w:tblLayout w:type="fixed"/>
         <w:tblLook w:firstColumn="1" w:firstRow="1" w:lastColumn="0" w:lastRow="0" w:noHBand="0" w:noVBand="1" w:val="04A0"/>
       </w:tblPr>
       <w:tblGrid>
-        <w:gridCol w:w="792"/>
-        <w:gridCol w:w="2059"/>
-        <w:gridCol w:w="5890"/>
-        <w:gridCol w:w="1296"/>
+        <w:gridCol w:w="576"/>
+        <w:gridCol w:w="1944"/>
+        <w:gridCol w:w="5976"/>
+        <w:gridCol w:w="1541"/>
       </w:tblGrid>
       <w:tr>
-        <w:trPr>
-          <w:tblHeader/>
-          <w:cantSplit/>
-        </w:trPr>
         <w:tc>
           <w:tcPr>
-            <w:tcW w:type="dxa" w:w="792"/>
-            <w:vAlign w:val="center"/>
-            <w:shd w:fill="173F35"/>
-            <w:tcBorders>
-              <w:top w:val="single" w:sz="4" w:color="D9D9D9"/>
-              <w:left w:val="single" w:sz="4" w:color="D9D9D9"/>
-              <w:bottom w:val="single" w:sz="4" w:color="D9D9D9"/>
-              <w:right w:val="single" w:sz="4" w:color="D9D9D9"/>
-            </w:tcBorders>
-            <w:tcMar>
-              <w:top w:w="95" w:type="dxa"/>
-              <w:left w:w="95" w:type="dxa"/>
-              <w:bottom w:w="95" w:type="dxa"/>
-              <w:right w:w="95" w:type="dxa"/>
-            </w:tcMar>
+            <w:tcW w:type="dxa" w:w="2509"/>
           </w:tcPr>
           <w:p>
-            <w:pPr>
-              <w:spacing w:after="60" w:line="250" w:lineRule="auto"/>
-              <w:jc w:val="center"/>
-            </w:pPr>
             <w:r>
-              <w:rPr>
-                <w:b/>
-                <w:color w:val="FFFFFF"/>
-                <w:sz w:val="18"/>
-              </w:rPr>
               <w:t>Day</w:t>
             </w:r>
           </w:p>
         </w:tc>
         <w:tc>
           <w:tcPr>
-            <w:tcW w:type="dxa" w:w="2059"/>
-            <w:vAlign w:val="center"/>
-            <w:shd w:fill="173F35"/>
-            <w:tcBorders>
-              <w:top w:val="single" w:sz="4" w:color="D9D9D9"/>
-              <w:left w:val="single" w:sz="4" w:color="D9D9D9"/>
-              <w:bottom w:val="single" w:sz="4" w:color="D9D9D9"/>
-              <w:right w:val="single" w:sz="4" w:color="D9D9D9"/>
-            </w:tcBorders>
-            <w:tcMar>
-              <w:top w:w="95" w:type="dxa"/>
-              <w:left w:w="95" w:type="dxa"/>
-              <w:bottom w:w="95" w:type="dxa"/>
-              <w:right w:w="95" w:type="dxa"/>
-            </w:tcMar>
+            <w:tcW w:type="dxa" w:w="2509"/>
           </w:tcPr>
           <w:p>
-            <w:pPr>
-              <w:spacing w:after="60" w:line="250" w:lineRule="auto"/>
-            </w:pPr>
             <w:r>
-              <w:rPr>
-                <w:b/>
-                <w:color w:val="FFFFFF"/>
-                <w:sz w:val="18"/>
-              </w:rPr>
               <w:t>Theme</w:t>
             </w:r>
           </w:p>
         </w:tc>
         <w:tc>
           <w:tcPr>
-            <w:tcW w:type="dxa" w:w="5890"/>
-            <w:vAlign w:val="center"/>
-            <w:shd w:fill="173F35"/>
-            <w:tcBorders>
-              <w:top w:val="single" w:sz="4" w:color="D9D9D9"/>
-              <w:left w:val="single" w:sz="4" w:color="D9D9D9"/>
-              <w:bottom w:val="single" w:sz="4" w:color="D9D9D9"/>
-              <w:right w:val="single" w:sz="4" w:color="D9D9D9"/>
-            </w:tcBorders>
-            <w:tcMar>
-              <w:top w:w="95" w:type="dxa"/>
-              <w:left w:w="95" w:type="dxa"/>
-              <w:bottom w:w="95" w:type="dxa"/>
-              <w:right w:w="95" w:type="dxa"/>
-            </w:tcMar>
+            <w:tcW w:type="dxa" w:w="2509"/>
           </w:tcPr>
           <w:p>
-            <w:pPr>
-              <w:spacing w:after="60" w:line="250" w:lineRule="auto"/>
-            </w:pPr>
             <w:r>
-              <w:rPr>
-                <w:b/>
-                <w:color w:val="FFFFFF"/>
-                <w:sz w:val="18"/>
-              </w:rPr>
               <w:t>Programme</w:t>
             </w:r>
           </w:p>
         </w:tc>
         <w:tc>
           <w:tcPr>
-            <w:tcW w:type="dxa" w:w="1296"/>
-            <w:vAlign w:val="center"/>
-            <w:shd w:fill="173F35"/>
-            <w:tcBorders>
-              <w:top w:val="single" w:sz="4" w:color="D9D9D9"/>
-              <w:left w:val="single" w:sz="4" w:color="D9D9D9"/>
-              <w:bottom w:val="single" w:sz="4" w:color="D9D9D9"/>
-              <w:right w:val="single" w:sz="4" w:color="D9D9D9"/>
-            </w:tcBorders>
-            <w:tcMar>
-              <w:top w:w="95" w:type="dxa"/>
-              <w:left w:w="95" w:type="dxa"/>
-              <w:bottom w:w="95" w:type="dxa"/>
-              <w:right w:w="95" w:type="dxa"/>
-            </w:tcMar>
+            <w:tcW w:type="dxa" w:w="2509"/>
           </w:tcPr>
           <w:p>
-            <w:pPr>
-              <w:spacing w:after="60" w:line="250" w:lineRule="auto"/>
-              <w:jc w:val="center"/>
-            </w:pPr>
             <w:r>
-              <w:rPr>
-                <w:b/>
-                <w:color w:val="FFFFFF"/>
-                <w:sz w:val="18"/>
-              </w:rPr>
               <w:t>Location</w:t>
             </w:r>
           </w:p>
@@ -205,57 +103,22 @@
         </w:trPr>
         <w:tc>
           <w:tcPr>
-            <w:tcW w:type="dxa" w:w="792"/>
-            <w:vAlign w:val="center"/>
-            <w:shd w:fill="F2F5F3"/>
-            <w:tcBorders>
-              <w:top w:val="single" w:sz="4" w:color="D9D9D9"/>
-              <w:left w:val="single" w:sz="4" w:color="D9D9D9"/>
-              <w:bottom w:val="single" w:sz="4" w:color="D9D9D9"/>
-              <w:right w:val="single" w:sz="4" w:color="D9D9D9"/>
-            </w:tcBorders>
-            <w:tcMar>
-              <w:top w:w="95" w:type="dxa"/>
-              <w:left w:w="95" w:type="dxa"/>
-              <w:bottom w:w="95" w:type="dxa"/>
-              <w:right w:w="95" w:type="dxa"/>
-            </w:tcMar>
+            <w:tcW w:type="dxa" w:w="2509"/>
           </w:tcPr>
           <w:p>
-            <w:pPr>
-              <w:spacing w:after="60" w:line="250" w:lineRule="auto"/>
-              <w:jc w:val="center"/>
-            </w:pPr>
             <w:r>
               <w:rPr>
                 <w:sz w:val="18"/>
               </w:rPr>
-              <w:t>D1</w:t>
+              <w:t>1</w:t>
             </w:r>
           </w:p>
         </w:tc>
         <w:tc>
           <w:tcPr>
-            <w:tcW w:type="dxa" w:w="2059"/>
-            <w:vAlign w:val="center"/>
-            <w:shd w:fill="F2F5F3"/>
-            <w:tcBorders>
-              <w:top w:val="single" w:sz="4" w:color="D9D9D9"/>
-              <w:left w:val="single" w:sz="4" w:color="D9D9D9"/>
-              <w:bottom w:val="single" w:sz="4" w:color="D9D9D9"/>
-              <w:right w:val="single" w:sz="4" w:color="D9D9D9"/>
-            </w:tcBorders>
-            <w:tcMar>
-              <w:top w:w="95" w:type="dxa"/>
-              <w:left w:w="95" w:type="dxa"/>
-              <w:bottom w:w="95" w:type="dxa"/>
-              <w:right w:w="95" w:type="dxa"/>
-            </w:tcMar>
+            <w:tcW w:type="dxa" w:w="2509"/>
           </w:tcPr>
           <w:p>
-            <w:pPr>
-              <w:spacing w:after="60" w:line="250" w:lineRule="auto"/>
-            </w:pPr>
             <w:r>
               <w:rPr>
                 <w:sz w:val="18"/>
@@ -266,59 +129,328 @@
         </w:tc>
         <w:tc>
           <w:tcPr>
-            <w:tcW w:type="dxa" w:w="5890"/>
-            <w:vAlign w:val="center"/>
-            <w:shd w:fill="F2F5F3"/>
-            <w:tcBorders>
-              <w:top w:val="single" w:sz="4" w:color="D9D9D9"/>
-              <w:left w:val="single" w:sz="4" w:color="D9D9D9"/>
-              <w:bottom w:val="single" w:sz="4" w:color="D9D9D9"/>
-              <w:right w:val="single" w:sz="4" w:color="D9D9D9"/>
-            </w:tcBorders>
-            <w:tcMar>
-              <w:top w:w="95" w:type="dxa"/>
-              <w:left w:w="95" w:type="dxa"/>
-              <w:bottom w:w="95" w:type="dxa"/>
-              <w:right w:w="95" w:type="dxa"/>
-            </w:tcMar>
+            <w:tcW w:type="dxa" w:w="2509"/>
           </w:tcPr>
           <w:p>
-            <w:pPr>
-              <w:spacing w:after="60" w:line="250" w:lineRule="auto"/>
-            </w:pPr>
             <w:r>
               <w:rPr>
                 <w:sz w:val="18"/>
               </w:rPr>
               <w:t>27 Mar · Sat</w:t>
               <w:br/>
-              <w:t>Arrive in Hangzhou, check in and rest. Join a relaxed welcome dinner and meet the group. No formal visits are scheduled.</w:t>
+              <w:t>Arrive in Shanghai, check in and rest. Meet the group over a relaxed welcome dinner. No formal visits are scheduled.</w:t>
             </w:r>
           </w:p>
         </w:tc>
         <w:tc>
           <w:tcPr>
-            <w:tcW w:type="dxa" w:w="1296"/>
-            <w:vAlign w:val="center"/>
-            <w:shd w:fill="F2F5F3"/>
-            <w:tcBorders>
-              <w:top w:val="single" w:sz="4" w:color="D9D9D9"/>
-              <w:left w:val="single" w:sz="4" w:color="D9D9D9"/>
-              <w:bottom w:val="single" w:sz="4" w:color="D9D9D9"/>
-              <w:right w:val="single" w:sz="4" w:color="D9D9D9"/>
-            </w:tcBorders>
-            <w:tcMar>
-              <w:top w:w="95" w:type="dxa"/>
-              <w:left w:w="95" w:type="dxa"/>
-              <w:bottom w:w="95" w:type="dxa"/>
-              <w:right w:w="95" w:type="dxa"/>
-            </w:tcMar>
+            <w:tcW w:type="dxa" w:w="2509"/>
           </w:tcPr>
           <w:p>
-            <w:pPr>
-              <w:spacing w:after="60" w:line="250" w:lineRule="auto"/>
-              <w:jc w:val="center"/>
-            </w:pPr>
+            <w:r>
+              <w:rPr>
+                <w:sz w:val="18"/>
+              </w:rPr>
+              <w:t>Shanghai</w:t>
+            </w:r>
+          </w:p>
+        </w:tc>
+      </w:tr>
+      <w:tr>
+        <w:trPr>
+          <w:cantSplit/>
+        </w:trPr>
+        <w:tc>
+          <w:tcPr>
+            <w:tcW w:type="dxa" w:w="2509"/>
+          </w:tcPr>
+          <w:p>
+            <w:r>
+              <w:rPr>
+                <w:sz w:val="18"/>
+              </w:rPr>
+              <w:t>2</w:t>
+            </w:r>
+          </w:p>
+        </w:tc>
+        <w:tc>
+          <w:tcPr>
+            <w:tcW w:type="dxa" w:w="2509"/>
+          </w:tcPr>
+          <w:p>
+            <w:r>
+              <w:rPr>
+                <w:sz w:val="18"/>
+              </w:rPr>
+              <w:t>Shanghai City Life</w:t>
+            </w:r>
+          </w:p>
+        </w:tc>
+        <w:tc>
+          <w:tcPr>
+            <w:tcW w:type="dxa" w:w="2509"/>
+          </w:tcPr>
+          <w:p>
+            <w:r>
+              <w:rPr>
+                <w:sz w:val="18"/>
+              </w:rPr>
+              <w:t>28 Mar · Sun</w:t>
+              <w:br/>
+              <w:t>Discover the Bund and the city on a relaxed guided walk. Enjoy the afternoon independently. An optional evening skyline experience can be arranged separately.</w:t>
+            </w:r>
+          </w:p>
+        </w:tc>
+        <w:tc>
+          <w:tcPr>
+            <w:tcW w:type="dxa" w:w="2509"/>
+          </w:tcPr>
+          <w:p>
+            <w:r>
+              <w:rPr>
+                <w:sz w:val="18"/>
+              </w:rPr>
+              <w:t>Shanghai</w:t>
+            </w:r>
+          </w:p>
+        </w:tc>
+      </w:tr>
+      <w:tr>
+        <w:trPr>
+          <w:cantSplit/>
+        </w:trPr>
+        <w:tc>
+          <w:tcPr>
+            <w:tcW w:type="dxa" w:w="2509"/>
+          </w:tcPr>
+          <w:p>
+            <w:r>
+              <w:rPr>
+                <w:sz w:val="18"/>
+              </w:rPr>
+              <w:t>3</w:t>
+            </w:r>
+          </w:p>
+        </w:tc>
+        <w:tc>
+          <w:tcPr>
+            <w:tcW w:type="dxa" w:w="2509"/>
+          </w:tcPr>
+          <w:p>
+            <w:r>
+              <w:rPr>
+                <w:sz w:val="18"/>
+              </w:rPr>
+              <w:t>Heritage &amp; Everyday Culture</w:t>
+            </w:r>
+          </w:p>
+        </w:tc>
+        <w:tc>
+          <w:tcPr>
+            <w:tcW w:type="dxa" w:w="2509"/>
+          </w:tcPr>
+          <w:p>
+            <w:r>
+              <w:rPr>
+                <w:sz w:val="18"/>
+              </w:rPr>
+              <w:t>29 Mar · Mon</w:t>
+              <w:br/>
+              <w:t>Explore Yu Garden and the old town or a historic neighbourhood. Discover contemporary Chinese consumer culture, cafés and everyday city life, with time to wander.</w:t>
+            </w:r>
+          </w:p>
+        </w:tc>
+        <w:tc>
+          <w:tcPr>
+            <w:tcW w:type="dxa" w:w="2509"/>
+          </w:tcPr>
+          <w:p>
+            <w:r>
+              <w:rPr>
+                <w:sz w:val="18"/>
+              </w:rPr>
+              <w:t>Shanghai</w:t>
+            </w:r>
+          </w:p>
+        </w:tc>
+      </w:tr>
+      <w:tr>
+        <w:trPr>
+          <w:cantSplit/>
+        </w:trPr>
+        <w:tc>
+          <w:tcPr>
+            <w:tcW w:type="dxa" w:w="2509"/>
+          </w:tcPr>
+          <w:p>
+            <w:r>
+              <w:rPr>
+                <w:sz w:val="18"/>
+              </w:rPr>
+              <w:t>4</w:t>
+            </w:r>
+          </w:p>
+        </w:tc>
+        <w:tc>
+          <w:tcPr>
+            <w:tcW w:type="dxa" w:w="2509"/>
+          </w:tcPr>
+          <w:p>
+            <w:r>
+              <w:rPr>
+                <w:sz w:val="18"/>
+              </w:rPr>
+              <w:t>Shanghai to Hangzhou</w:t>
+            </w:r>
+          </w:p>
+        </w:tc>
+        <w:tc>
+          <w:tcPr>
+            <w:tcW w:type="dxa" w:w="2509"/>
+          </w:tcPr>
+          <w:p>
+            <w:r>
+              <w:rPr>
+                <w:sz w:val="18"/>
+              </w:rPr>
+              <w:t>30 Mar · Tue</w:t>
+              <w:br/>
+              <w:t>Transfer to Hangzhou after breakfast, check in and settle into the second hotel. Take a gentle afternoon walk by West Lake. Transfer mode and times are to be confirmed.</w:t>
+            </w:r>
+          </w:p>
+        </w:tc>
+        <w:tc>
+          <w:tcPr>
+            <w:tcW w:type="dxa" w:w="2509"/>
+          </w:tcPr>
+          <w:p>
+            <w:r>
+              <w:rPr>
+                <w:sz w:val="18"/>
+              </w:rPr>
+              <w:t>Shanghai → Hangzhou</w:t>
+            </w:r>
+          </w:p>
+        </w:tc>
+      </w:tr>
+    </w:tbl>
+    <w:p>
+      <w:r>
+        <w:br w:type="page"/>
+      </w:r>
+    </w:p>
+    <w:p>
+      <w:pPr>
+        <w:pStyle w:val="Heading1"/>
+      </w:pPr>
+      <w:r>
+        <w:t>Hangzhou at a more relaxed pace</w:t>
+      </w:r>
+    </w:p>
+    <w:tbl>
+      <w:tblPr>
+        <w:tblStyle w:val="LightShading-Accent1"/>
+        <w:tblW w:type="auto" w:w="0"/>
+        <w:tblLook w:firstColumn="1" w:firstRow="1" w:lastColumn="0" w:lastRow="0" w:noHBand="0" w:noVBand="1" w:val="04A0"/>
+      </w:tblPr>
+      <w:tblGrid>
+        <w:gridCol w:w="576"/>
+        <w:gridCol w:w="1944"/>
+        <w:gridCol w:w="5976"/>
+        <w:gridCol w:w="1541"/>
+      </w:tblGrid>
+      <w:tr>
+        <w:tc>
+          <w:tcPr>
+            <w:tcW w:type="dxa" w:w="2509"/>
+          </w:tcPr>
+          <w:p>
+            <w:r>
+              <w:t>Day</w:t>
+            </w:r>
+          </w:p>
+        </w:tc>
+        <w:tc>
+          <w:tcPr>
+            <w:tcW w:type="dxa" w:w="2509"/>
+          </w:tcPr>
+          <w:p>
+            <w:r>
+              <w:t>Theme</w:t>
+            </w:r>
+          </w:p>
+        </w:tc>
+        <w:tc>
+          <w:tcPr>
+            <w:tcW w:type="dxa" w:w="2509"/>
+          </w:tcPr>
+          <w:p>
+            <w:r>
+              <w:t>Programme</w:t>
+            </w:r>
+          </w:p>
+        </w:tc>
+        <w:tc>
+          <w:tcPr>
+            <w:tcW w:type="dxa" w:w="2509"/>
+          </w:tcPr>
+          <w:p>
+            <w:r>
+              <w:t>Location</w:t>
+            </w:r>
+          </w:p>
+        </w:tc>
+      </w:tr>
+      <w:tr>
+        <w:trPr>
+          <w:cantSplit/>
+        </w:trPr>
+        <w:tc>
+          <w:tcPr>
+            <w:tcW w:type="dxa" w:w="2509"/>
+          </w:tcPr>
+          <w:p>
+            <w:r>
+              <w:rPr>
+                <w:sz w:val="18"/>
+              </w:rPr>
+              <w:t>5</w:t>
+            </w:r>
+          </w:p>
+        </w:tc>
+        <w:tc>
+          <w:tcPr>
+            <w:tcW w:type="dxa" w:w="2509"/>
+          </w:tcPr>
+          <w:p>
+            <w:r>
+              <w:rPr>
+                <w:sz w:val="18"/>
+              </w:rPr>
+              <w:t>Robotics &amp; Free Exploration</w:t>
+            </w:r>
+          </w:p>
+        </w:tc>
+        <w:tc>
+          <w:tcPr>
+            <w:tcW w:type="dxa" w:w="2509"/>
+          </w:tcPr>
+          <w:p>
+            <w:r>
+              <w:rPr>
+                <w:sz w:val="18"/>
+              </w:rPr>
+              <w:t>31 Mar · Wed</w:t>
+              <w:br/>
+              <w:t>A proposed morning visit to Unitree Robotics, exploring robotics products and applications. Keep the afternoon free to discover Hangzhou or rest. Host confirmation is pending.</w:t>
+            </w:r>
+          </w:p>
+        </w:tc>
+        <w:tc>
+          <w:tcPr>
+            <w:tcW w:type="dxa" w:w="2509"/>
+          </w:tcPr>
+          <w:p>
             <w:r>
               <w:rPr>
                 <w:sz w:val="18"/>
@@ -334,120 +466,50 @@
         </w:trPr>
         <w:tc>
           <w:tcPr>
-            <w:tcW w:type="dxa" w:w="792"/>
-            <w:vAlign w:val="center"/>
-            <w:shd w:fill="FFFFFF"/>
-            <w:tcBorders>
-              <w:top w:val="single" w:sz="4" w:color="D9D9D9"/>
-              <w:left w:val="single" w:sz="4" w:color="D9D9D9"/>
-              <w:bottom w:val="single" w:sz="4" w:color="D9D9D9"/>
-              <w:right w:val="single" w:sz="4" w:color="D9D9D9"/>
-            </w:tcBorders>
-            <w:tcMar>
-              <w:top w:w="95" w:type="dxa"/>
-              <w:left w:w="95" w:type="dxa"/>
-              <w:bottom w:w="95" w:type="dxa"/>
-              <w:right w:w="95" w:type="dxa"/>
-            </w:tcMar>
+            <w:tcW w:type="dxa" w:w="2509"/>
           </w:tcPr>
           <w:p>
-            <w:pPr>
-              <w:spacing w:after="60" w:line="250" w:lineRule="auto"/>
-              <w:jc w:val="center"/>
-            </w:pPr>
             <w:r>
               <w:rPr>
                 <w:sz w:val="18"/>
               </w:rPr>
-              <w:t>D2</w:t>
+              <w:t>6</w:t>
             </w:r>
           </w:p>
         </w:tc>
         <w:tc>
           <w:tcPr>
-            <w:tcW w:type="dxa" w:w="2059"/>
-            <w:vAlign w:val="center"/>
-            <w:shd w:fill="FFFFFF"/>
-            <w:tcBorders>
-              <w:top w:val="single" w:sz="4" w:color="D9D9D9"/>
-              <w:left w:val="single" w:sz="4" w:color="D9D9D9"/>
-              <w:bottom w:val="single" w:sz="4" w:color="D9D9D9"/>
-              <w:right w:val="single" w:sz="4" w:color="D9D9D9"/>
-            </w:tcBorders>
-            <w:tcMar>
-              <w:top w:w="95" w:type="dxa"/>
-              <w:left w:w="95" w:type="dxa"/>
-              <w:bottom w:w="95" w:type="dxa"/>
-              <w:right w:w="95" w:type="dxa"/>
-            </w:tcMar>
+            <w:tcW w:type="dxa" w:w="2509"/>
           </w:tcPr>
           <w:p>
-            <w:pPr>
-              <w:spacing w:after="60" w:line="250" w:lineRule="auto"/>
-            </w:pPr>
             <w:r>
               <w:rPr>
                 <w:sz w:val="18"/>
               </w:rPr>
-              <w:t>Discover Hangzhou</w:t>
+              <w:t>Longjing Tea &amp; Village Life</w:t>
             </w:r>
           </w:p>
         </w:tc>
         <w:tc>
           <w:tcPr>
-            <w:tcW w:type="dxa" w:w="5890"/>
-            <w:vAlign w:val="center"/>
-            <w:shd w:fill="FFFFFF"/>
-            <w:tcBorders>
-              <w:top w:val="single" w:sz="4" w:color="D9D9D9"/>
-              <w:left w:val="single" w:sz="4" w:color="D9D9D9"/>
-              <w:bottom w:val="single" w:sz="4" w:color="D9D9D9"/>
-              <w:right w:val="single" w:sz="4" w:color="D9D9D9"/>
-            </w:tcBorders>
-            <w:tcMar>
-              <w:top w:w="95" w:type="dxa"/>
-              <w:left w:w="95" w:type="dxa"/>
-              <w:bottom w:w="95" w:type="dxa"/>
-              <w:right w:w="95" w:type="dxa"/>
-            </w:tcMar>
+            <w:tcW w:type="dxa" w:w="2509"/>
           </w:tcPr>
           <w:p>
-            <w:pPr>
-              <w:spacing w:after="60" w:line="250" w:lineRule="auto"/>
-            </w:pPr>
             <w:r>
               <w:rPr>
                 <w:sz w:val="18"/>
               </w:rPr>
-              <w:t>28 Mar · Sun</w:t>
+              <w:t>1 Apr · Thu</w:t>
               <w:br/>
-              <w:t>Morning: a gentle cultural walk around West Lake. Afternoon: programme orientation, an introduction to the robotics ecosystem and participant introductions; the formal session lasts no more than two hours.</w:t>
+              <w:t>Spend a relaxed day experiencing Longjing tea culture and walking through a tea-growing village. Allow time for conversation and rest. Venue and seasonal activities are to be confirmed.</w:t>
             </w:r>
           </w:p>
         </w:tc>
         <w:tc>
           <w:tcPr>
-            <w:tcW w:type="dxa" w:w="1296"/>
-            <w:vAlign w:val="center"/>
-            <w:shd w:fill="FFFFFF"/>
-            <w:tcBorders>
-              <w:top w:val="single" w:sz="4" w:color="D9D9D9"/>
-              <w:left w:val="single" w:sz="4" w:color="D9D9D9"/>
-              <w:bottom w:val="single" w:sz="4" w:color="D9D9D9"/>
-              <w:right w:val="single" w:sz="4" w:color="D9D9D9"/>
-            </w:tcBorders>
-            <w:tcMar>
-              <w:top w:w="95" w:type="dxa"/>
-              <w:left w:w="95" w:type="dxa"/>
-              <w:bottom w:w="95" w:type="dxa"/>
-              <w:right w:w="95" w:type="dxa"/>
-            </w:tcMar>
+            <w:tcW w:type="dxa" w:w="2509"/>
           </w:tcPr>
           <w:p>
-            <w:pPr>
-              <w:spacing w:after="60" w:line="250" w:lineRule="auto"/>
-              <w:jc w:val="center"/>
-            </w:pPr>
             <w:r>
               <w:rPr>
                 <w:sz w:val="18"/>
@@ -463,120 +525,50 @@
         </w:trPr>
         <w:tc>
           <w:tcPr>
-            <w:tcW w:type="dxa" w:w="792"/>
-            <w:vAlign w:val="center"/>
-            <w:shd w:fill="F2F5F3"/>
-            <w:tcBorders>
-              <w:top w:val="single" w:sz="4" w:color="D9D9D9"/>
-              <w:left w:val="single" w:sz="4" w:color="D9D9D9"/>
-              <w:bottom w:val="single" w:sz="4" w:color="D9D9D9"/>
-              <w:right w:val="single" w:sz="4" w:color="D9D9D9"/>
-            </w:tcBorders>
-            <w:tcMar>
-              <w:top w:w="95" w:type="dxa"/>
-              <w:left w:w="95" w:type="dxa"/>
-              <w:bottom w:w="95" w:type="dxa"/>
-              <w:right w:w="95" w:type="dxa"/>
-            </w:tcMar>
+            <w:tcW w:type="dxa" w:w="2509"/>
           </w:tcPr>
           <w:p>
-            <w:pPr>
-              <w:spacing w:after="60" w:line="250" w:lineRule="auto"/>
-              <w:jc w:val="center"/>
-            </w:pPr>
             <w:r>
               <w:rPr>
                 <w:sz w:val="18"/>
               </w:rPr>
-              <w:t>D3</w:t>
+              <w:t>7</w:t>
             </w:r>
           </w:p>
         </w:tc>
         <w:tc>
           <w:tcPr>
-            <w:tcW w:type="dxa" w:w="2059"/>
-            <w:vAlign w:val="center"/>
-            <w:shd w:fill="F2F5F3"/>
-            <w:tcBorders>
-              <w:top w:val="single" w:sz="4" w:color="D9D9D9"/>
-              <w:left w:val="single" w:sz="4" w:color="D9D9D9"/>
-              <w:bottom w:val="single" w:sz="4" w:color="D9D9D9"/>
-              <w:right w:val="single" w:sz="4" w:color="D9D9D9"/>
-            </w:tcBorders>
-            <w:tcMar>
-              <w:top w:w="95" w:type="dxa"/>
-              <w:left w:w="95" w:type="dxa"/>
-              <w:bottom w:w="95" w:type="dxa"/>
-              <w:right w:w="95" w:type="dxa"/>
-            </w:tcMar>
+            <w:tcW w:type="dxa" w:w="2509"/>
           </w:tcPr>
           <w:p>
-            <w:pPr>
-              <w:spacing w:after="60" w:line="250" w:lineRule="auto"/>
-            </w:pPr>
             <w:r>
               <w:rPr>
                 <w:sz w:val="18"/>
               </w:rPr>
-              <w:t>Robotics &amp; Research</w:t>
+              <w:t>Robotics &amp; Conversations</w:t>
             </w:r>
           </w:p>
         </w:tc>
         <w:tc>
           <w:tcPr>
-            <w:tcW w:type="dxa" w:w="5890"/>
-            <w:vAlign w:val="center"/>
-            <w:shd w:fill="F2F5F3"/>
-            <w:tcBorders>
-              <w:top w:val="single" w:sz="4" w:color="D9D9D9"/>
-              <w:left w:val="single" w:sz="4" w:color="D9D9D9"/>
-              <w:bottom w:val="single" w:sz="4" w:color="D9D9D9"/>
-              <w:right w:val="single" w:sz="4" w:color="D9D9D9"/>
-            </w:tcBorders>
-            <w:tcMar>
-              <w:top w:w="95" w:type="dxa"/>
-              <w:left w:w="95" w:type="dxa"/>
-              <w:bottom w:w="95" w:type="dxa"/>
-              <w:right w:w="95" w:type="dxa"/>
-            </w:tcMar>
+            <w:tcW w:type="dxa" w:w="2509"/>
           </w:tcPr>
           <w:p>
-            <w:pPr>
-              <w:spacing w:after="60" w:line="250" w:lineRule="auto"/>
-            </w:pPr>
             <w:r>
               <w:rPr>
                 <w:sz w:val="18"/>
               </w:rPr>
-              <w:t>29 Mar · Mon</w:t>
+              <w:t>2 Apr · Fri</w:t>
               <w:br/>
-              <w:t>Morning: proposed visit to Westlake Robotics, with a demonstration and discussion of technology and commercialisation. Afternoon: a research-team exchange, preferably with a relevant Westlake University team. Both hosts are subject to confirmation.</w:t>
+              <w:t>A proposed morning visit to Westlake Robotics. The afternoon is free, with an optional informal conversation for participants who want to reflect on the visit. Host confirmation is pending.</w:t>
             </w:r>
           </w:p>
         </w:tc>
         <w:tc>
           <w:tcPr>
-            <w:tcW w:type="dxa" w:w="1296"/>
-            <w:vAlign w:val="center"/>
-            <w:shd w:fill="F2F5F3"/>
-            <w:tcBorders>
-              <w:top w:val="single" w:sz="4" w:color="D9D9D9"/>
-              <w:left w:val="single" w:sz="4" w:color="D9D9D9"/>
-              <w:bottom w:val="single" w:sz="4" w:color="D9D9D9"/>
-              <w:right w:val="single" w:sz="4" w:color="D9D9D9"/>
-            </w:tcBorders>
-            <w:tcMar>
-              <w:top w:w="95" w:type="dxa"/>
-              <w:left w:w="95" w:type="dxa"/>
-              <w:bottom w:w="95" w:type="dxa"/>
-              <w:right w:w="95" w:type="dxa"/>
-            </w:tcMar>
+            <w:tcW w:type="dxa" w:w="2509"/>
           </w:tcPr>
           <w:p>
-            <w:pPr>
-              <w:spacing w:after="60" w:line="250" w:lineRule="auto"/>
-              <w:jc w:val="center"/>
-            </w:pPr>
             <w:r>
               <w:rPr>
                 <w:sz w:val="18"/>
@@ -592,422 +584,50 @@
         </w:trPr>
         <w:tc>
           <w:tcPr>
-            <w:tcW w:type="dxa" w:w="792"/>
-            <w:vAlign w:val="center"/>
-            <w:shd w:fill="FFFFFF"/>
-            <w:tcBorders>
-              <w:top w:val="single" w:sz="4" w:color="D9D9D9"/>
-              <w:left w:val="single" w:sz="4" w:color="D9D9D9"/>
-              <w:bottom w:val="single" w:sz="4" w:color="D9D9D9"/>
-              <w:right w:val="single" w:sz="4" w:color="D9D9D9"/>
-            </w:tcBorders>
-            <w:tcMar>
-              <w:top w:w="95" w:type="dxa"/>
-              <w:left w:w="95" w:type="dxa"/>
-              <w:bottom w:w="95" w:type="dxa"/>
-              <w:right w:w="95" w:type="dxa"/>
-            </w:tcMar>
+            <w:tcW w:type="dxa" w:w="2509"/>
           </w:tcPr>
           <w:p>
-            <w:pPr>
-              <w:spacing w:after="60" w:line="250" w:lineRule="auto"/>
-              <w:jc w:val="center"/>
-            </w:pPr>
             <w:r>
               <w:rPr>
                 <w:sz w:val="18"/>
               </w:rPr>
-              <w:t>D4</w:t>
+              <w:t>8</w:t>
             </w:r>
           </w:p>
         </w:tc>
         <w:tc>
           <w:tcPr>
-            <w:tcW w:type="dxa" w:w="2059"/>
-            <w:vAlign w:val="center"/>
-            <w:shd w:fill="FFFFFF"/>
-            <w:tcBorders>
-              <w:top w:val="single" w:sz="4" w:color="D9D9D9"/>
-              <w:left w:val="single" w:sz="4" w:color="D9D9D9"/>
-              <w:bottom w:val="single" w:sz="4" w:color="D9D9D9"/>
-              <w:right w:val="single" w:sz="4" w:color="D9D9D9"/>
-            </w:tcBorders>
-            <w:tcMar>
-              <w:top w:w="95" w:type="dxa"/>
-              <w:left w:w="95" w:type="dxa"/>
-              <w:bottom w:w="95" w:type="dxa"/>
-              <w:right w:w="95" w:type="dxa"/>
-            </w:tcMar>
+            <w:tcW w:type="dxa" w:w="2509"/>
           </w:tcPr>
           <w:p>
-            <w:pPr>
-              <w:spacing w:after="60" w:line="250" w:lineRule="auto"/>
-            </w:pPr>
             <w:r>
               <w:rPr>
                 <w:sz w:val="18"/>
               </w:rPr>
-              <w:t>From Robotics to Market</w:t>
+              <w:t>China–Europe Innovation Salon</w:t>
             </w:r>
           </w:p>
         </w:tc>
         <w:tc>
           <w:tcPr>
-            <w:tcW w:type="dxa" w:w="5890"/>
-            <w:vAlign w:val="center"/>
-            <w:shd w:fill="FFFFFF"/>
-            <w:tcBorders>
-              <w:top w:val="single" w:sz="4" w:color="D9D9D9"/>
-              <w:left w:val="single" w:sz="4" w:color="D9D9D9"/>
-              <w:bottom w:val="single" w:sz="4" w:color="D9D9D9"/>
-              <w:right w:val="single" w:sz="4" w:color="D9D9D9"/>
-            </w:tcBorders>
-            <w:tcMar>
-              <w:top w:w="95" w:type="dxa"/>
-              <w:left w:w="95" w:type="dxa"/>
-              <w:bottom w:w="95" w:type="dxa"/>
-              <w:right w:w="95" w:type="dxa"/>
-            </w:tcMar>
+            <w:tcW w:type="dxa" w:w="2509"/>
           </w:tcPr>
           <w:p>
-            <w:pPr>
-              <w:spacing w:after="60" w:line="250" w:lineRule="auto"/>
-            </w:pPr>
             <w:r>
               <w:rPr>
                 <w:sz w:val="18"/>
               </w:rPr>
-              <w:t>30 Mar · Tue</w:t>
+              <w:t>3 Apr · Sat</w:t>
               <w:br/>
-              <w:t>A proposed half-day visit to Unitree Robotics, exploring product development, developer ecosystems and international markets. The other half-day is free, with an optional informal reflection session. Visit subject to confirmation.</w:t>
+              <w:t>A relaxed half-day morning salon with a few short project introductions, small-group discussions and open networking. No mandatory pitch or written submission. Enjoy a free afternoon and a farewell dinner. Guests are to be confirmed.</w:t>
             </w:r>
           </w:p>
         </w:tc>
         <w:tc>
           <w:tcPr>
-            <w:tcW w:type="dxa" w:w="1296"/>
-            <w:vAlign w:val="center"/>
-            <w:shd w:fill="FFFFFF"/>
-            <w:tcBorders>
-              <w:top w:val="single" w:sz="4" w:color="D9D9D9"/>
-              <w:left w:val="single" w:sz="4" w:color="D9D9D9"/>
-              <w:bottom w:val="single" w:sz="4" w:color="D9D9D9"/>
-              <w:right w:val="single" w:sz="4" w:color="D9D9D9"/>
-            </w:tcBorders>
-            <w:tcMar>
-              <w:top w:w="95" w:type="dxa"/>
-              <w:left w:w="95" w:type="dxa"/>
-              <w:bottom w:w="95" w:type="dxa"/>
-              <w:right w:w="95" w:type="dxa"/>
-            </w:tcMar>
+            <w:tcW w:type="dxa" w:w="2509"/>
           </w:tcPr>
           <w:p>
-            <w:pPr>
-              <w:spacing w:after="60" w:line="250" w:lineRule="auto"/>
-              <w:jc w:val="center"/>
-            </w:pPr>
-            <w:r>
-              <w:rPr>
-                <w:sz w:val="18"/>
-              </w:rPr>
-              <w:t>Hangzhou</w:t>
-            </w:r>
-          </w:p>
-        </w:tc>
-      </w:tr>
-    </w:tbl>
-    <w:p>
-      <w:pPr>
-        <w:spacing w:after="0"/>
-      </w:pPr>
-    </w:p>
-    <w:p>
-      <w:r>
-        <w:br w:type="page"/>
-      </w:r>
-    </w:p>
-    <w:p>
-      <w:pPr>
-        <w:pStyle w:val="Heading1"/>
-      </w:pPr>
-      <w:r>
-        <w:t>Applications and innovation exchange</w:t>
-      </w:r>
-    </w:p>
-    <w:p>
-      <w:r>
-        <w:t>The programme combines focused professional sessions with time to reflect, connect and explore independently.</w:t>
-      </w:r>
-    </w:p>
-    <w:tbl>
-      <w:tblPr>
-        <w:tblW w:type="auto" w:w="0"/>
-        <w:jc w:val="center"/>
-        <w:tblLayout w:type="fixed"/>
-        <w:tblLook w:firstColumn="1" w:firstRow="1" w:lastColumn="0" w:lastRow="0" w:noHBand="0" w:noVBand="1" w:val="04A0"/>
-      </w:tblPr>
-      <w:tblGrid>
-        <w:gridCol w:w="792"/>
-        <w:gridCol w:w="2059"/>
-        <w:gridCol w:w="5890"/>
-        <w:gridCol w:w="1296"/>
-      </w:tblGrid>
-      <w:tr>
-        <w:trPr>
-          <w:tblHeader/>
-          <w:cantSplit/>
-        </w:trPr>
-        <w:tc>
-          <w:tcPr>
-            <w:tcW w:type="dxa" w:w="792"/>
-            <w:vAlign w:val="center"/>
-            <w:shd w:fill="173F35"/>
-            <w:tcBorders>
-              <w:top w:val="single" w:sz="4" w:color="D9D9D9"/>
-              <w:left w:val="single" w:sz="4" w:color="D9D9D9"/>
-              <w:bottom w:val="single" w:sz="4" w:color="D9D9D9"/>
-              <w:right w:val="single" w:sz="4" w:color="D9D9D9"/>
-            </w:tcBorders>
-            <w:tcMar>
-              <w:top w:w="95" w:type="dxa"/>
-              <w:left w:w="95" w:type="dxa"/>
-              <w:bottom w:w="95" w:type="dxa"/>
-              <w:right w:w="95" w:type="dxa"/>
-            </w:tcMar>
-          </w:tcPr>
-          <w:p>
-            <w:pPr>
-              <w:spacing w:after="60" w:line="250" w:lineRule="auto"/>
-              <w:jc w:val="center"/>
-            </w:pPr>
-            <w:r>
-              <w:rPr>
-                <w:b/>
-                <w:color w:val="FFFFFF"/>
-                <w:sz w:val="18"/>
-              </w:rPr>
-              <w:t>Day</w:t>
-            </w:r>
-          </w:p>
-        </w:tc>
-        <w:tc>
-          <w:tcPr>
-            <w:tcW w:type="dxa" w:w="2059"/>
-            <w:vAlign w:val="center"/>
-            <w:shd w:fill="173F35"/>
-            <w:tcBorders>
-              <w:top w:val="single" w:sz="4" w:color="D9D9D9"/>
-              <w:left w:val="single" w:sz="4" w:color="D9D9D9"/>
-              <w:bottom w:val="single" w:sz="4" w:color="D9D9D9"/>
-              <w:right w:val="single" w:sz="4" w:color="D9D9D9"/>
-            </w:tcBorders>
-            <w:tcMar>
-              <w:top w:w="95" w:type="dxa"/>
-              <w:left w:w="95" w:type="dxa"/>
-              <w:bottom w:w="95" w:type="dxa"/>
-              <w:right w:w="95" w:type="dxa"/>
-            </w:tcMar>
-          </w:tcPr>
-          <w:p>
-            <w:pPr>
-              <w:spacing w:after="60" w:line="250" w:lineRule="auto"/>
-            </w:pPr>
-            <w:r>
-              <w:rPr>
-                <w:b/>
-                <w:color w:val="FFFFFF"/>
-                <w:sz w:val="18"/>
-              </w:rPr>
-              <w:t>Theme</w:t>
-            </w:r>
-          </w:p>
-        </w:tc>
-        <w:tc>
-          <w:tcPr>
-            <w:tcW w:type="dxa" w:w="5890"/>
-            <w:vAlign w:val="center"/>
-            <w:shd w:fill="173F35"/>
-            <w:tcBorders>
-              <w:top w:val="single" w:sz="4" w:color="D9D9D9"/>
-              <w:left w:val="single" w:sz="4" w:color="D9D9D9"/>
-              <w:bottom w:val="single" w:sz="4" w:color="D9D9D9"/>
-              <w:right w:val="single" w:sz="4" w:color="D9D9D9"/>
-            </w:tcBorders>
-            <w:tcMar>
-              <w:top w:w="95" w:type="dxa"/>
-              <w:left w:w="95" w:type="dxa"/>
-              <w:bottom w:w="95" w:type="dxa"/>
-              <w:right w:w="95" w:type="dxa"/>
-            </w:tcMar>
-          </w:tcPr>
-          <w:p>
-            <w:pPr>
-              <w:spacing w:after="60" w:line="250" w:lineRule="auto"/>
-            </w:pPr>
-            <w:r>
-              <w:rPr>
-                <w:b/>
-                <w:color w:val="FFFFFF"/>
-                <w:sz w:val="18"/>
-              </w:rPr>
-              <w:t>Programme</w:t>
-            </w:r>
-          </w:p>
-        </w:tc>
-        <w:tc>
-          <w:tcPr>
-            <w:tcW w:type="dxa" w:w="1296"/>
-            <w:vAlign w:val="center"/>
-            <w:shd w:fill="173F35"/>
-            <w:tcBorders>
-              <w:top w:val="single" w:sz="4" w:color="D9D9D9"/>
-              <w:left w:val="single" w:sz="4" w:color="D9D9D9"/>
-              <w:bottom w:val="single" w:sz="4" w:color="D9D9D9"/>
-              <w:right w:val="single" w:sz="4" w:color="D9D9D9"/>
-            </w:tcBorders>
-            <w:tcMar>
-              <w:top w:w="95" w:type="dxa"/>
-              <w:left w:w="95" w:type="dxa"/>
-              <w:bottom w:w="95" w:type="dxa"/>
-              <w:right w:w="95" w:type="dxa"/>
-            </w:tcMar>
-          </w:tcPr>
-          <w:p>
-            <w:pPr>
-              <w:spacing w:after="60" w:line="250" w:lineRule="auto"/>
-              <w:jc w:val="center"/>
-            </w:pPr>
-            <w:r>
-              <w:rPr>
-                <w:b/>
-                <w:color w:val="FFFFFF"/>
-                <w:sz w:val="18"/>
-              </w:rPr>
-              <w:t>Location</w:t>
-            </w:r>
-          </w:p>
-        </w:tc>
-      </w:tr>
-      <w:tr>
-        <w:trPr>
-          <w:cantSplit/>
-        </w:trPr>
-        <w:tc>
-          <w:tcPr>
-            <w:tcW w:type="dxa" w:w="792"/>
-            <w:vAlign w:val="center"/>
-            <w:shd w:fill="F2F5F3"/>
-            <w:tcBorders>
-              <w:top w:val="single" w:sz="4" w:color="D9D9D9"/>
-              <w:left w:val="single" w:sz="4" w:color="D9D9D9"/>
-              <w:bottom w:val="single" w:sz="4" w:color="D9D9D9"/>
-              <w:right w:val="single" w:sz="4" w:color="D9D9D9"/>
-            </w:tcBorders>
-            <w:tcMar>
-              <w:top w:w="95" w:type="dxa"/>
-              <w:left w:w="95" w:type="dxa"/>
-              <w:bottom w:w="95" w:type="dxa"/>
-              <w:right w:w="95" w:type="dxa"/>
-            </w:tcMar>
-          </w:tcPr>
-          <w:p>
-            <w:pPr>
-              <w:spacing w:after="60" w:line="250" w:lineRule="auto"/>
-              <w:jc w:val="center"/>
-            </w:pPr>
-            <w:r>
-              <w:rPr>
-                <w:sz w:val="18"/>
-              </w:rPr>
-              <w:t>D5</w:t>
-            </w:r>
-          </w:p>
-        </w:tc>
-        <w:tc>
-          <w:tcPr>
-            <w:tcW w:type="dxa" w:w="2059"/>
-            <w:vAlign w:val="center"/>
-            <w:shd w:fill="F2F5F3"/>
-            <w:tcBorders>
-              <w:top w:val="single" w:sz="4" w:color="D9D9D9"/>
-              <w:left w:val="single" w:sz="4" w:color="D9D9D9"/>
-              <w:bottom w:val="single" w:sz="4" w:color="D9D9D9"/>
-              <w:right w:val="single" w:sz="4" w:color="D9D9D9"/>
-            </w:tcBorders>
-            <w:tcMar>
-              <w:top w:w="95" w:type="dxa"/>
-              <w:left w:w="95" w:type="dxa"/>
-              <w:bottom w:w="95" w:type="dxa"/>
-              <w:right w:w="95" w:type="dxa"/>
-            </w:tcMar>
-          </w:tcPr>
-          <w:p>
-            <w:pPr>
-              <w:spacing w:after="60" w:line="250" w:lineRule="auto"/>
-            </w:pPr>
-            <w:r>
-              <w:rPr>
-                <w:sz w:val="18"/>
-              </w:rPr>
-              <w:t>Robotics in Real-World Applications</w:t>
-            </w:r>
-          </w:p>
-        </w:tc>
-        <w:tc>
-          <w:tcPr>
-            <w:tcW w:type="dxa" w:w="5890"/>
-            <w:vAlign w:val="center"/>
-            <w:shd w:fill="F2F5F3"/>
-            <w:tcBorders>
-              <w:top w:val="single" w:sz="4" w:color="D9D9D9"/>
-              <w:left w:val="single" w:sz="4" w:color="D9D9D9"/>
-              <w:bottom w:val="single" w:sz="4" w:color="D9D9D9"/>
-              <w:right w:val="single" w:sz="4" w:color="D9D9D9"/>
-            </w:tcBorders>
-            <w:tcMar>
-              <w:top w:w="95" w:type="dxa"/>
-              <w:left w:w="95" w:type="dxa"/>
-              <w:bottom w:w="95" w:type="dxa"/>
-              <w:right w:w="95" w:type="dxa"/>
-            </w:tcMar>
-          </w:tcPr>
-          <w:p>
-            <w:pPr>
-              <w:spacing w:after="60" w:line="250" w:lineRule="auto"/>
-            </w:pPr>
-            <w:r>
-              <w:rPr>
-                <w:sz w:val="18"/>
-              </w:rPr>
-              <w:t>31 Mar · Wed</w:t>
-              <w:br/>
-              <w:t>A proposed half-day visit to one of DEEP Robotics, Hikrobot or BrainCo, depending on availability. Explore field robotics, industrial automation or human-machine interaction and bionic technology. The other half-day is free. One host will be selected; none is confirmed.</w:t>
-            </w:r>
-          </w:p>
-        </w:tc>
-        <w:tc>
-          <w:tcPr>
-            <w:tcW w:type="dxa" w:w="1296"/>
-            <w:vAlign w:val="center"/>
-            <w:shd w:fill="F2F5F3"/>
-            <w:tcBorders>
-              <w:top w:val="single" w:sz="4" w:color="D9D9D9"/>
-              <w:left w:val="single" w:sz="4" w:color="D9D9D9"/>
-              <w:bottom w:val="single" w:sz="4" w:color="D9D9D9"/>
-              <w:right w:val="single" w:sz="4" w:color="D9D9D9"/>
-            </w:tcBorders>
-            <w:tcMar>
-              <w:top w:w="95" w:type="dxa"/>
-              <w:left w:w="95" w:type="dxa"/>
-              <w:bottom w:w="95" w:type="dxa"/>
-              <w:right w:w="95" w:type="dxa"/>
-            </w:tcMar>
-          </w:tcPr>
-          <w:p>
-            <w:pPr>
-              <w:spacing w:after="60" w:line="250" w:lineRule="auto"/>
-              <w:jc w:val="center"/>
-            </w:pPr>
             <w:r>
               <w:rPr>
                 <w:sz w:val="18"/>
@@ -1023,444 +643,22 @@
         </w:trPr>
         <w:tc>
           <w:tcPr>
-            <w:tcW w:type="dxa" w:w="792"/>
-            <w:vAlign w:val="center"/>
-            <w:shd w:fill="FFFFFF"/>
-            <w:tcBorders>
-              <w:top w:val="single" w:sz="4" w:color="D9D9D9"/>
-              <w:left w:val="single" w:sz="4" w:color="D9D9D9"/>
-              <w:bottom w:val="single" w:sz="4" w:color="D9D9D9"/>
-              <w:right w:val="single" w:sz="4" w:color="D9D9D9"/>
-            </w:tcBorders>
-            <w:tcMar>
-              <w:top w:w="95" w:type="dxa"/>
-              <w:left w:w="95" w:type="dxa"/>
-              <w:bottom w:w="95" w:type="dxa"/>
-              <w:right w:w="95" w:type="dxa"/>
-            </w:tcMar>
+            <w:tcW w:type="dxa" w:w="2509"/>
           </w:tcPr>
           <w:p>
-            <w:pPr>
-              <w:spacing w:after="60" w:line="250" w:lineRule="auto"/>
-              <w:jc w:val="center"/>
-            </w:pPr>
             <w:r>
               <w:rPr>
                 <w:sz w:val="18"/>
               </w:rPr>
-              <w:t>D6</w:t>
+              <w:t>9</w:t>
             </w:r>
           </w:p>
         </w:tc>
         <w:tc>
           <w:tcPr>
-            <w:tcW w:type="dxa" w:w="2059"/>
-            <w:vAlign w:val="center"/>
-            <w:shd w:fill="FFFFFF"/>
-            <w:tcBorders>
-              <w:top w:val="single" w:sz="4" w:color="D9D9D9"/>
-              <w:left w:val="single" w:sz="4" w:color="D9D9D9"/>
-              <w:bottom w:val="single" w:sz="4" w:color="D9D9D9"/>
-              <w:right w:val="single" w:sz="4" w:color="D9D9D9"/>
-            </w:tcBorders>
-            <w:tcMar>
-              <w:top w:w="95" w:type="dxa"/>
-              <w:left w:w="95" w:type="dxa"/>
-              <w:bottom w:w="95" w:type="dxa"/>
-              <w:right w:w="95" w:type="dxa"/>
-            </w:tcMar>
+            <w:tcW w:type="dxa" w:w="2509"/>
           </w:tcPr>
           <w:p>
-            <w:pPr>
-              <w:spacing w:after="60" w:line="250" w:lineRule="auto"/>
-            </w:pPr>
-            <w:r>
-              <w:rPr>
-                <w:sz w:val="18"/>
-              </w:rPr>
-              <w:t>Robotics Innovation Workshop</w:t>
-            </w:r>
-          </w:p>
-        </w:tc>
-        <w:tc>
-          <w:tcPr>
-            <w:tcW w:type="dxa" w:w="5890"/>
-            <w:vAlign w:val="center"/>
-            <w:shd w:fill="FFFFFF"/>
-            <w:tcBorders>
-              <w:top w:val="single" w:sz="4" w:color="D9D9D9"/>
-              <w:left w:val="single" w:sz="4" w:color="D9D9D9"/>
-              <w:bottom w:val="single" w:sz="4" w:color="D9D9D9"/>
-              <w:right w:val="single" w:sz="4" w:color="D9D9D9"/>
-            </w:tcBorders>
-            <w:tcMar>
-              <w:top w:w="95" w:type="dxa"/>
-              <w:left w:w="95" w:type="dxa"/>
-              <w:bottom w:w="95" w:type="dxa"/>
-              <w:right w:w="95" w:type="dxa"/>
-            </w:tcMar>
-          </w:tcPr>
-          <w:p>
-            <w:pPr>
-              <w:spacing w:after="60" w:line="250" w:lineRule="auto"/>
-            </w:pPr>
-            <w:r>
-              <w:rPr>
-                <w:sz w:val="18"/>
-              </w:rPr>
-              <w:t>1 Apr · Thu</w:t>
-              <w:br/>
-              <w:t>Around four facilitated hours in approximately six teams. Explore a real user need, technical feasibility, a business model and a China-Europe collaboration opportunity. Produce a one-page concept and a three-minute presentation. Finish early in the afternoon.</w:t>
-            </w:r>
-          </w:p>
-        </w:tc>
-        <w:tc>
-          <w:tcPr>
-            <w:tcW w:type="dxa" w:w="1296"/>
-            <w:vAlign w:val="center"/>
-            <w:shd w:fill="FFFFFF"/>
-            <w:tcBorders>
-              <w:top w:val="single" w:sz="4" w:color="D9D9D9"/>
-              <w:left w:val="single" w:sz="4" w:color="D9D9D9"/>
-              <w:bottom w:val="single" w:sz="4" w:color="D9D9D9"/>
-              <w:right w:val="single" w:sz="4" w:color="D9D9D9"/>
-            </w:tcBorders>
-            <w:tcMar>
-              <w:top w:w="95" w:type="dxa"/>
-              <w:left w:w="95" w:type="dxa"/>
-              <w:bottom w:w="95" w:type="dxa"/>
-              <w:right w:w="95" w:type="dxa"/>
-            </w:tcMar>
-          </w:tcPr>
-          <w:p>
-            <w:pPr>
-              <w:spacing w:after="60" w:line="250" w:lineRule="auto"/>
-              <w:jc w:val="center"/>
-            </w:pPr>
-            <w:r>
-              <w:rPr>
-                <w:sz w:val="18"/>
-              </w:rPr>
-              <w:t>Hangzhou</w:t>
-            </w:r>
-          </w:p>
-        </w:tc>
-      </w:tr>
-      <w:tr>
-        <w:trPr>
-          <w:cantSplit/>
-        </w:trPr>
-        <w:tc>
-          <w:tcPr>
-            <w:tcW w:type="dxa" w:w="792"/>
-            <w:vAlign w:val="center"/>
-            <w:shd w:fill="F2F5F3"/>
-            <w:tcBorders>
-              <w:top w:val="single" w:sz="4" w:color="D9D9D9"/>
-              <w:left w:val="single" w:sz="4" w:color="D9D9D9"/>
-              <w:bottom w:val="single" w:sz="4" w:color="D9D9D9"/>
-              <w:right w:val="single" w:sz="4" w:color="D9D9D9"/>
-            </w:tcBorders>
-            <w:tcMar>
-              <w:top w:w="95" w:type="dxa"/>
-              <w:left w:w="95" w:type="dxa"/>
-              <w:bottom w:w="95" w:type="dxa"/>
-              <w:right w:w="95" w:type="dxa"/>
-            </w:tcMar>
-          </w:tcPr>
-          <w:p>
-            <w:pPr>
-              <w:spacing w:after="60" w:line="250" w:lineRule="auto"/>
-              <w:jc w:val="center"/>
-            </w:pPr>
-            <w:r>
-              <w:rPr>
-                <w:sz w:val="18"/>
-              </w:rPr>
-              <w:t>D7</w:t>
-            </w:r>
-          </w:p>
-        </w:tc>
-        <w:tc>
-          <w:tcPr>
-            <w:tcW w:type="dxa" w:w="2059"/>
-            <w:vAlign w:val="center"/>
-            <w:shd w:fill="F2F5F3"/>
-            <w:tcBorders>
-              <w:top w:val="single" w:sz="4" w:color="D9D9D9"/>
-              <w:left w:val="single" w:sz="4" w:color="D9D9D9"/>
-              <w:bottom w:val="single" w:sz="4" w:color="D9D9D9"/>
-              <w:right w:val="single" w:sz="4" w:color="D9D9D9"/>
-            </w:tcBorders>
-            <w:tcMar>
-              <w:top w:w="95" w:type="dxa"/>
-              <w:left w:w="95" w:type="dxa"/>
-              <w:bottom w:w="95" w:type="dxa"/>
-              <w:right w:w="95" w:type="dxa"/>
-            </w:tcMar>
-          </w:tcPr>
-          <w:p>
-            <w:pPr>
-              <w:spacing w:after="60" w:line="250" w:lineRule="auto"/>
-            </w:pPr>
-            <w:r>
-              <w:rPr>
-                <w:sz w:val="18"/>
-              </w:rPr>
-              <w:t>China-Europe Innovation Exchange</w:t>
-            </w:r>
-          </w:p>
-        </w:tc>
-        <w:tc>
-          <w:tcPr>
-            <w:tcW w:type="dxa" w:w="5890"/>
-            <w:vAlign w:val="center"/>
-            <w:shd w:fill="F2F5F3"/>
-            <w:tcBorders>
-              <w:top w:val="single" w:sz="4" w:color="D9D9D9"/>
-              <w:left w:val="single" w:sz="4" w:color="D9D9D9"/>
-              <w:bottom w:val="single" w:sz="4" w:color="D9D9D9"/>
-              <w:right w:val="single" w:sz="4" w:color="D9D9D9"/>
-            </w:tcBorders>
-            <w:tcMar>
-              <w:top w:w="95" w:type="dxa"/>
-              <w:left w:w="95" w:type="dxa"/>
-              <w:bottom w:w="95" w:type="dxa"/>
-              <w:right w:w="95" w:type="dxa"/>
-            </w:tcMar>
-          </w:tcPr>
-          <w:p>
-            <w:pPr>
-              <w:spacing w:after="60" w:line="250" w:lineRule="auto"/>
-            </w:pPr>
-            <w:r>
-              <w:rPr>
-                <w:sz w:val="18"/>
-              </w:rPr>
-              <w:t>2 Apr · Fri</w:t>
-              <w:br/>
-              <w:t>Four to six short project presentations, a themed roundtable and pre-arranged conversations with invited entrepreneurs, researchers and industry representatives. Conclude with next-step discussions and a farewell dinner. Guest participation is subject to confirmation.</w:t>
-            </w:r>
-          </w:p>
-        </w:tc>
-        <w:tc>
-          <w:tcPr>
-            <w:tcW w:type="dxa" w:w="1296"/>
-            <w:vAlign w:val="center"/>
-            <w:shd w:fill="F2F5F3"/>
-            <w:tcBorders>
-              <w:top w:val="single" w:sz="4" w:color="D9D9D9"/>
-              <w:left w:val="single" w:sz="4" w:color="D9D9D9"/>
-              <w:bottom w:val="single" w:sz="4" w:color="D9D9D9"/>
-              <w:right w:val="single" w:sz="4" w:color="D9D9D9"/>
-            </w:tcBorders>
-            <w:tcMar>
-              <w:top w:w="95" w:type="dxa"/>
-              <w:left w:w="95" w:type="dxa"/>
-              <w:bottom w:w="95" w:type="dxa"/>
-              <w:right w:w="95" w:type="dxa"/>
-            </w:tcMar>
-          </w:tcPr>
-          <w:p>
-            <w:pPr>
-              <w:spacing w:after="60" w:line="250" w:lineRule="auto"/>
-              <w:jc w:val="center"/>
-            </w:pPr>
-            <w:r>
-              <w:rPr>
-                <w:sz w:val="18"/>
-              </w:rPr>
-              <w:t>Hangzhou</w:t>
-            </w:r>
-          </w:p>
-        </w:tc>
-      </w:tr>
-      <w:tr>
-        <w:trPr>
-          <w:cantSplit/>
-        </w:trPr>
-        <w:tc>
-          <w:tcPr>
-            <w:tcW w:type="dxa" w:w="792"/>
-            <w:vAlign w:val="center"/>
-            <w:shd w:fill="FFFFFF"/>
-            <w:tcBorders>
-              <w:top w:val="single" w:sz="4" w:color="D9D9D9"/>
-              <w:left w:val="single" w:sz="4" w:color="D9D9D9"/>
-              <w:bottom w:val="single" w:sz="4" w:color="D9D9D9"/>
-              <w:right w:val="single" w:sz="4" w:color="D9D9D9"/>
-            </w:tcBorders>
-            <w:tcMar>
-              <w:top w:w="95" w:type="dxa"/>
-              <w:left w:w="95" w:type="dxa"/>
-              <w:bottom w:w="95" w:type="dxa"/>
-              <w:right w:w="95" w:type="dxa"/>
-            </w:tcMar>
-          </w:tcPr>
-          <w:p>
-            <w:pPr>
-              <w:spacing w:after="60" w:line="250" w:lineRule="auto"/>
-              <w:jc w:val="center"/>
-            </w:pPr>
-            <w:r>
-              <w:rPr>
-                <w:sz w:val="18"/>
-              </w:rPr>
-              <w:t>D8</w:t>
-            </w:r>
-          </w:p>
-        </w:tc>
-        <w:tc>
-          <w:tcPr>
-            <w:tcW w:type="dxa" w:w="2059"/>
-            <w:vAlign w:val="center"/>
-            <w:shd w:fill="FFFFFF"/>
-            <w:tcBorders>
-              <w:top w:val="single" w:sz="4" w:color="D9D9D9"/>
-              <w:left w:val="single" w:sz="4" w:color="D9D9D9"/>
-              <w:bottom w:val="single" w:sz="4" w:color="D9D9D9"/>
-              <w:right w:val="single" w:sz="4" w:color="D9D9D9"/>
-            </w:tcBorders>
-            <w:tcMar>
-              <w:top w:w="95" w:type="dxa"/>
-              <w:left w:w="95" w:type="dxa"/>
-              <w:bottom w:w="95" w:type="dxa"/>
-              <w:right w:w="95" w:type="dxa"/>
-            </w:tcMar>
-          </w:tcPr>
-          <w:p>
-            <w:pPr>
-              <w:spacing w:after="60" w:line="250" w:lineRule="auto"/>
-            </w:pPr>
-            <w:r>
-              <w:rPr>
-                <w:sz w:val="18"/>
-              </w:rPr>
-              <w:t>Tea Culture &amp; Free Exploration</w:t>
-            </w:r>
-          </w:p>
-        </w:tc>
-        <w:tc>
-          <w:tcPr>
-            <w:tcW w:type="dxa" w:w="5890"/>
-            <w:vAlign w:val="center"/>
-            <w:shd w:fill="FFFFFF"/>
-            <w:tcBorders>
-              <w:top w:val="single" w:sz="4" w:color="D9D9D9"/>
-              <w:left w:val="single" w:sz="4" w:color="D9D9D9"/>
-              <w:bottom w:val="single" w:sz="4" w:color="D9D9D9"/>
-              <w:right w:val="single" w:sz="4" w:color="D9D9D9"/>
-            </w:tcBorders>
-            <w:tcMar>
-              <w:top w:w="95" w:type="dxa"/>
-              <w:left w:w="95" w:type="dxa"/>
-              <w:bottom w:w="95" w:type="dxa"/>
-              <w:right w:w="95" w:type="dxa"/>
-            </w:tcMar>
-          </w:tcPr>
-          <w:p>
-            <w:pPr>
-              <w:spacing w:after="60" w:line="250" w:lineRule="auto"/>
-            </w:pPr>
-            <w:r>
-              <w:rPr>
-                <w:sz w:val="18"/>
-              </w:rPr>
-              <w:t>3 Apr · Sat</w:t>
-              <w:br/>
-              <w:t>A relaxed tea-culture experience and group lunch. Enjoy the afternoon independently, with time to explore the city or rest. No compulsory business activities.</w:t>
-            </w:r>
-          </w:p>
-        </w:tc>
-        <w:tc>
-          <w:tcPr>
-            <w:tcW w:type="dxa" w:w="1296"/>
-            <w:vAlign w:val="center"/>
-            <w:shd w:fill="FFFFFF"/>
-            <w:tcBorders>
-              <w:top w:val="single" w:sz="4" w:color="D9D9D9"/>
-              <w:left w:val="single" w:sz="4" w:color="D9D9D9"/>
-              <w:bottom w:val="single" w:sz="4" w:color="D9D9D9"/>
-              <w:right w:val="single" w:sz="4" w:color="D9D9D9"/>
-            </w:tcBorders>
-            <w:tcMar>
-              <w:top w:w="95" w:type="dxa"/>
-              <w:left w:w="95" w:type="dxa"/>
-              <w:bottom w:w="95" w:type="dxa"/>
-              <w:right w:w="95" w:type="dxa"/>
-            </w:tcMar>
-          </w:tcPr>
-          <w:p>
-            <w:pPr>
-              <w:spacing w:after="60" w:line="250" w:lineRule="auto"/>
-              <w:jc w:val="center"/>
-            </w:pPr>
-            <w:r>
-              <w:rPr>
-                <w:sz w:val="18"/>
-              </w:rPr>
-              <w:t>Hangzhou</w:t>
-            </w:r>
-          </w:p>
-        </w:tc>
-      </w:tr>
-      <w:tr>
-        <w:trPr>
-          <w:cantSplit/>
-        </w:trPr>
-        <w:tc>
-          <w:tcPr>
-            <w:tcW w:type="dxa" w:w="792"/>
-            <w:vAlign w:val="center"/>
-            <w:shd w:fill="F2F5F3"/>
-            <w:tcBorders>
-              <w:top w:val="single" w:sz="4" w:color="D9D9D9"/>
-              <w:left w:val="single" w:sz="4" w:color="D9D9D9"/>
-              <w:bottom w:val="single" w:sz="4" w:color="D9D9D9"/>
-              <w:right w:val="single" w:sz="4" w:color="D9D9D9"/>
-            </w:tcBorders>
-            <w:tcMar>
-              <w:top w:w="95" w:type="dxa"/>
-              <w:left w:w="95" w:type="dxa"/>
-              <w:bottom w:w="95" w:type="dxa"/>
-              <w:right w:w="95" w:type="dxa"/>
-            </w:tcMar>
-          </w:tcPr>
-          <w:p>
-            <w:pPr>
-              <w:spacing w:after="60" w:line="250" w:lineRule="auto"/>
-              <w:jc w:val="center"/>
-            </w:pPr>
-            <w:r>
-              <w:rPr>
-                <w:sz w:val="18"/>
-              </w:rPr>
-              <w:t>D9</w:t>
-            </w:r>
-          </w:p>
-        </w:tc>
-        <w:tc>
-          <w:tcPr>
-            <w:tcW w:type="dxa" w:w="2059"/>
-            <w:vAlign w:val="center"/>
-            <w:shd w:fill="F2F5F3"/>
-            <w:tcBorders>
-              <w:top w:val="single" w:sz="4" w:color="D9D9D9"/>
-              <w:left w:val="single" w:sz="4" w:color="D9D9D9"/>
-              <w:bottom w:val="single" w:sz="4" w:color="D9D9D9"/>
-              <w:right w:val="single" w:sz="4" w:color="D9D9D9"/>
-            </w:tcBorders>
-            <w:tcMar>
-              <w:top w:w="95" w:type="dxa"/>
-              <w:left w:w="95" w:type="dxa"/>
-              <w:bottom w:w="95" w:type="dxa"/>
-              <w:right w:w="95" w:type="dxa"/>
-            </w:tcMar>
-          </w:tcPr>
-          <w:p>
-            <w:pPr>
-              <w:spacing w:after="60" w:line="250" w:lineRule="auto"/>
-            </w:pPr>
             <w:r>
               <w:rPr>
                 <w:sz w:val="18"/>
@@ -1471,77 +669,37 @@
         </w:tc>
         <w:tc>
           <w:tcPr>
-            <w:tcW w:type="dxa" w:w="5890"/>
-            <w:vAlign w:val="center"/>
-            <w:shd w:fill="F2F5F3"/>
-            <w:tcBorders>
-              <w:top w:val="single" w:sz="4" w:color="D9D9D9"/>
-              <w:left w:val="single" w:sz="4" w:color="D9D9D9"/>
-              <w:bottom w:val="single" w:sz="4" w:color="D9D9D9"/>
-              <w:right w:val="single" w:sz="4" w:color="D9D9D9"/>
-            </w:tcBorders>
-            <w:tcMar>
-              <w:top w:w="95" w:type="dxa"/>
-              <w:left w:w="95" w:type="dxa"/>
-              <w:bottom w:w="95" w:type="dxa"/>
-              <w:right w:w="95" w:type="dxa"/>
-            </w:tcMar>
+            <w:tcW w:type="dxa" w:w="2509"/>
           </w:tcPr>
           <w:p>
-            <w:pPr>
-              <w:spacing w:after="60" w:line="250" w:lineRule="auto"/>
-            </w:pPr>
             <w:r>
               <w:rPr>
                 <w:sz w:val="18"/>
               </w:rPr>
               <w:t>4 Apr · Sun</w:t>
               <w:br/>
-              <w:t>Breakfast, check-out and scheduled group transfers to Hangzhou airport or railway station. Transfer windows will be agreed before departure; individual transfers outside them are not included.</w:t>
+              <w:t>Breakfast and check-out, followed by agreed group transfers. The departure airport or railway station and transfer windows will be confirmed around participants’ flights. A return to Shanghai is not assumed.</w:t>
             </w:r>
           </w:p>
         </w:tc>
         <w:tc>
           <w:tcPr>
-            <w:tcW w:type="dxa" w:w="1296"/>
-            <w:vAlign w:val="center"/>
-            <w:shd w:fill="F2F5F3"/>
-            <w:tcBorders>
-              <w:top w:val="single" w:sz="4" w:color="D9D9D9"/>
-              <w:left w:val="single" w:sz="4" w:color="D9D9D9"/>
-              <w:bottom w:val="single" w:sz="4" w:color="D9D9D9"/>
-              <w:right w:val="single" w:sz="4" w:color="D9D9D9"/>
-            </w:tcBorders>
-            <w:tcMar>
-              <w:top w:w="95" w:type="dxa"/>
-              <w:left w:w="95" w:type="dxa"/>
-              <w:bottom w:w="95" w:type="dxa"/>
-              <w:right w:w="95" w:type="dxa"/>
-            </w:tcMar>
+            <w:tcW w:type="dxa" w:w="2509"/>
           </w:tcPr>
           <w:p>
-            <w:pPr>
-              <w:spacing w:after="60" w:line="250" w:lineRule="auto"/>
-              <w:jc w:val="center"/>
-            </w:pPr>
             <w:r>
               <w:rPr>
                 <w:sz w:val="18"/>
               </w:rPr>
-              <w:t>Hangzhou</w:t>
+              <w:t>Hangzhou / departure point TBC</w:t>
             </w:r>
           </w:p>
         </w:tc>
       </w:tr>
     </w:tbl>
     <w:p>
-      <w:pPr>
-        <w:spacing w:after="0"/>
-      </w:pPr>
-    </w:p>
-    <w:p>
       <w:r>
-        <w:t>Daily rhythm: formal sessions normally begin no earlier than 09:30 and finish by 17:00. Allow time for interpretation, lunch and transfers. Exact times and locations will be confirmed with hosts.</w:t>
+        <w:t>Both company visits are proposed, not confirmed. Most afternoons and evenings remain free or lightly scheduled. Optional evening activities are separate from the base programme.</w:t>
       </w:r>
     </w:p>
     <w:p>
@@ -1554,48 +712,17 @@
         <w:pStyle w:val="Heading1"/>
       </w:pPr>
       <w:r>
-        <w:t>Two ways to build new connections</w:t>
-      </w:r>
-    </w:p>
-    <w:p>
-      <w:pPr>
-        <w:pStyle w:val="Heading2"/>
-      </w:pPr>
-      <w:r>
-        <w:t>D6 Robotics Innovation Workshop</w:t>
+        <w:t>A lighter format for innovation exchange</w:t>
       </w:r>
     </w:p>
     <w:p>
       <w:r>
-        <w:t>Approximately six teams work for around four facilitated hours on inspection, logistics or service-robotics opportunities. No coding or hardware-operation experience is required.</w:t>
+        <w:t>Day 8: a half-day morning China–Europe Innovation Salon. A few short project introductions, small-group discussions and open networking build on the robotics visits. No coding experience, written concept or pitch from every participant is required. Guests and venue remain unconfirmed.</w:t>
       </w:r>
     </w:p>
     <w:p>
       <w:r>
-        <w:t>Suggested flow: 30 minutes to frame a user need; 60 minutes to develop a solution; a 15-minute break; 60 minutes on feasibility, business model and China-Europe collaboration; 45 minutes for presentations and feedback; 30 minutes for next steps.</w:t>
-      </w:r>
-    </w:p>
-    <w:p>
-      <w:r>
-        <w:t>Output: a one-page English concept and a three-minute team presentation. The session finishes early in the afternoon.</w:t>
-      </w:r>
-    </w:p>
-    <w:p>
-      <w:pPr>
-        <w:pStyle w:val="Heading2"/>
-      </w:pPr>
-      <w:r>
-        <w:t>D7 China-Europe Innovation Exchange</w:t>
-      </w:r>
-    </w:p>
-    <w:p>
-      <w:r>
-        <w:t>Four to six short project presentations, a themed roundtable and pre-arranged conversations with invited entrepreneurs, researchers and industry representatives. Selected workshop ideas can inform the discussion; not every participant needs to pitch again.</w:t>
-      </w:r>
-    </w:p>
-    <w:p>
-      <w:r>
-        <w:t>Output: a list of collaboration questions and agreed follow-up actions. Guest attendance is subject to confirmation. Funding, orders and commercial outcomes are not guaranteed.</w:t>
+        <w:t>Participants may join discussions or listen and arrange voluntary follow-ups. No funding, orders or commercial outcomes are promised. The afternoon is free, followed by a farewell dinner.</w:t>
       </w:r>
     </w:p>
     <w:p>
@@ -1608,16 +735,11 @@
     </w:p>
     <w:p>
       <w:r>
-        <w:t>Single occupancy: price to be confirmed</w:t>
+        <w:t>Shanghai: 3 nights. Hangzhou: 5 nights. Breakfast included, with one hotel change.</w:t>
         <w:br/>
-        <w:t>Twin share: price to be confirmed</w:t>
+        <w:t>Single occupancy: price TBC. Twin share: price TBC.</w:t>
         <w:br/>
-        <w:t>Both options include the same programme. International flights are excluded. Prices will be confirmed after supplier quotations and programme arrangements are finalised.</w:t>
-      </w:r>
-    </w:p>
-    <w:p>
-      <w:r>
-        <w:t>Eight nights in the same comfortable business hotel; hotel to be confirmed. Twin-share arrangements must be agreed before booking. If a suitable roommate is unavailable, single-room alternatives and any supplement will be discussed before commitment.</w:t>
+        <w:t>Prices depend on supplier quotations and final arrangements. Roommate matching and any single-room supplement must be agreed before commitment. International flights are excluded.</w:t>
       </w:r>
     </w:p>
     <w:p>
@@ -1625,12 +747,12 @@
         <w:pStyle w:val="Heading2"/>
       </w:pPr>
       <w:r>
-        <w:t>Included</w:t>
+        <w:t>Planned inclusions</w:t>
       </w:r>
     </w:p>
     <w:p>
       <w:r>
-        <w:t>Eight hotel nights with breakfast; scheduled group meals, including welcome and farewell dinners; scheduled local group transport and arrival/departure transfers; programme visits, workshop and exchange activities; bilingual tour coordination and Chinese-English interpretation; scheduled cultural activities.</w:t>
+        <w:t>Eight hotel nights with breakfast: three nights in Shanghai and five in Hangzhou; scheduled group meals, including welcome and farewell dinners; the Shanghai–Hangzhou group transfer, scheduled local group transport and agreed arrival/departure transfers; two proposed company visits, a half-day innovation salon and scheduled cultural activities; bilingual coordination and Chinese–English interpretation.</w:t>
       </w:r>
     </w:p>
     <w:p>
@@ -1643,7 +765,20 @@
     </w:p>
     <w:p>
       <w:r>
-        <w:t>International flights; visas; personal travel and medical insurance; meals during free time; personal spending; optional activities; extra hotel nights; transfers outside the scheduled group windows.</w:t>
+        <w:t>International flights; visas; personal travel and medical insurance; meals during free time; personal spending; optional activities including optional evening experiences; extra hotel nights; transfers outside the agreed group windows.</w:t>
+      </w:r>
+    </w:p>
+    <w:p>
+      <w:pPr>
+        <w:pStyle w:val="Heading2"/>
+      </w:pPr>
+      <w:r>
+        <w:t>Arrival and departure</w:t>
+      </w:r>
+    </w:p>
+    <w:p>
+      <w:r>
+        <w:t>Arrival is planned in Shanghai. Check-out on Day 9 is in Hangzhou. The departure airport or railway station and group transfer windows will be agreed around participants’ flights; a same-day return to Shanghai is not assumed.</w:t>
       </w:r>
     </w:p>
     <w:p>
@@ -1656,7 +791,7 @@
     </w:p>
     <w:p>
       <w:r>
-        <w:t>Proposed programme for discussion, not a confirmed booking offer. Dates, host organisations, guests, venues, visit order and prices are provisional. Final arrangements depend on host availability, supplier quotations and participants' holiday calendars. Visits do not imply partnerships or endorsement.</w:t>
+        <w:t>Dates, hosts, guests, venues, transfer arrangements and prices are provisional. Final arrangements depend on host availability, supplier quotations and participants’ holidays and flights. This is a discussion itinerary, not a confirmed booking offer. Visits do not imply partnerships or endorsement.</w:t>
       </w:r>
     </w:p>
     <w:sectPr>
@@ -2033,7 +1168,7 @@
     <w:qFormat/>
     <w:rsid w:val="00FC693F"/>
     <w:pPr>
-      <w:spacing w:after="140" w:line="259" w:lineRule="auto"/>
+      <w:spacing w:after="140" w:line="264" w:lineRule="auto"/>
     </w:pPr>
     <w:rPr>
       <w:rFonts w:ascii="Calibri" w:hAnsi="Calibri"/>
@@ -2104,7 +1239,7 @@
       <w:b/>
       <w:bCs/>
       <w:color w:val="000000"/>
-      <w:sz w:val="36"/>
+      <w:sz w:val="28"/>
       <w:szCs w:val="28"/>
     </w:rPr>
   </w:style>
@@ -2128,7 +1263,7 @@
       <w:b/>
       <w:bCs/>
       <w:color w:val="000000"/>
-      <w:sz w:val="24"/>
+      <w:sz w:val="26"/>
       <w:szCs w:val="26"/>
     </w:rPr>
   </w:style>
@@ -2390,7 +1525,7 @@
       <w:color w:val="000000"/>
       <w:spacing w:val="5"/>
       <w:kern w:val="28"/>
-      <w:sz w:val="52"/>
+      <w:sz w:val="50"/>
       <w:szCs w:val="52"/>
     </w:rPr>
   </w:style>

</xml_diff>